<commit_message>
Bring both split papers' author summaries inside the PLOS 150-200 word range
Paper 1 was at 226 words and Paper 2 at 224. Abstracts: 261 and 266 against
the 300-word limit.

Co-Authored-By: Claude Opus 5 <noreply@anthropic.com>
Claude-Session: https://claude.ai/code/session_01PjfG7i2deAXT3znmpkGkmY
</commit_message>
<xml_diff>
--- a/paper/manuscript/paper1/paper1.docx
+++ b/paper/manuscript/paper1/paper1.docx
@@ -1730,7 +1730,7 @@
         <w:pStyle w:val="FirstParagraph"/>
       </w:pPr>
       <w:r>
-        <w:t xml:space="preserve">Two cancer cells with the same genome, given the same drug, can meet opposite fates. Part of that difference can come from which genes each cell happens to be expressing strongly when treatment begins, and cells pass those states to their daughters when they divide. The simulators used to test single-cell analysis methods model neither growth nor division, so they cannot produce such inherited states; those that do model dividing cells carry no drug.</w:t>
+        <w:t xml:space="preserve">Two cancer cells with the same genome, given the same drug, can meet opposite fates. Part of that difference comes from which genes each is expressing strongly when treatment begins, and cells pass those states to their daughters. The simulators used to test single-cell methods model neither growth nor division, so they cannot produce such inherited states; those that do model dividing cells carry no drug.</w:t>
       </w:r>
     </w:p>
     <w:p>
@@ -1738,7 +1738,7 @@
         <w:pStyle w:val="BodyText"/>
       </w:pPr>
       <w:r>
-        <w:t xml:space="preserve">We built Biomodelling.jl 2.0, in which chemical reactions play out inside cells that grow, copy their genes, divide and meet drugs on realistic schedules. Expression memory, cell-size effects and cell-cycle dependence emerge from that physiology rather than being assumed. We checked it against cases whose answers are known exactly in mathematics, used it to measure how much accuracy methods for reconstructing gene networks lose when cells grow and divide, and fitted it to published time-lapse recordings of cells under chemotherapy.</w:t>
+        <w:t xml:space="preserve">We built Biomodelling.jl 2.0, in which chemical reactions play out inside cells that grow, copy their genes, divide and meet drugs on realistic schedules. Expression memory, cell-size effects and cell-cycle dependence emerge rather than being assumed. We checked it against cases whose answers are known exactly in mathematics, measured how much accuracy gene-network reconstruction loses when cells grow and divide, and fitted it to published recordings of cells under chemotherapy.</w:t>
       </w:r>
     </w:p>
     <w:p>
@@ -1746,7 +1746,7 @@
         <w:pStyle w:val="BodyText"/>
       </w:pPr>
       <w:r>
-        <w:t xml:space="preserve">That last exercise is where a mechanistic model earns its keep. The recordings can be fitted, but they do not pin the model down: how long cells remember their state, and whether they were spared because of what they inherited or because of where they were in the cell cycle, are both left open. A model that names its mechanisms can say so; one fitted to the same numbers without them cannot.</w:t>
+        <w:t xml:space="preserve">That last exercise is where a mechanistic model earns its keep. The recordings can be fitted, but do not pin the model down: how long cells remember their state, and whether they were spared by inheritance or by cycle position, are both left open. A model that names its mechanisms can say so; one fitted to the same numbers cannot.</w:t>
       </w:r>
     </w:p>
     <w:p>

</xml_diff>